<commit_message>
Sprechtext verständlicher: Alltagsvergleiche, weniger Fachjargon, Begriffsliste
Co-Authored-By: Claude Opus 5.5 <noreply@anthropic.com>
Claude-Session: https://claude.ai/code/session_013vrRC9ggswsEWMp2ebeFzZ
</commit_message>
<xml_diff>
--- a/vortrag4/Vortrag4_Sprechtext.docx
+++ b/vortrag4/Vortrag4_Sprechtext.docx
@@ -133,6 +133,9 @@
         <w:gridCol w:w="1134"/>
       </w:tblGrid>
       <w:tr>
+        <w:trPr>
+          <w:cantSplit/>
+        </w:trPr>
         <w:tc>
           <w:tcPr>
             <w:tcW w:type="dxa" w:w="2268"/>
@@ -187,6 +190,9 @@
         </w:tc>
       </w:tr>
       <w:tr>
+        <w:trPr>
+          <w:cantSplit/>
+        </w:trPr>
         <w:tc>
           <w:tcPr>
             <w:tcW w:type="dxa" w:w="2268"/>
@@ -241,6 +247,9 @@
         </w:tc>
       </w:tr>
       <w:tr>
+        <w:trPr>
+          <w:cantSplit/>
+        </w:trPr>
         <w:tc>
           <w:tcPr>
             <w:tcW w:type="dxa" w:w="2268"/>
@@ -295,6 +304,9 @@
         </w:tc>
       </w:tr>
       <w:tr>
+        <w:trPr>
+          <w:cantSplit/>
+        </w:trPr>
         <w:tc>
           <w:tcPr>
             <w:tcW w:type="dxa" w:w="2268"/>
@@ -386,6 +398,9 @@
         <w:gridCol w:w="5953"/>
       </w:tblGrid>
       <w:tr>
+        <w:trPr>
+          <w:cantSplit/>
+        </w:trPr>
         <w:tc>
           <w:tcPr>
             <w:tcW w:type="dxa" w:w="3402"/>
@@ -414,6 +429,9 @@
         </w:tc>
       </w:tr>
       <w:tr>
+        <w:trPr>
+          <w:cantSplit/>
+        </w:trPr>
         <w:tc>
           <w:tcPr>
             <w:tcW w:type="dxa" w:w="3402"/>
@@ -442,6 +460,9 @@
         </w:tc>
       </w:tr>
       <w:tr>
+        <w:trPr>
+          <w:cantSplit/>
+        </w:trPr>
         <w:tc>
           <w:tcPr>
             <w:tcW w:type="dxa" w:w="3402"/>
@@ -470,6 +491,9 @@
         </w:tc>
       </w:tr>
       <w:tr>
+        <w:trPr>
+          <w:cantSplit/>
+        </w:trPr>
         <w:tc>
           <w:tcPr>
             <w:tcW w:type="dxa" w:w="3402"/>
@@ -498,6 +522,9 @@
         </w:tc>
       </w:tr>
       <w:tr>
+        <w:trPr>
+          <w:cantSplit/>
+        </w:trPr>
         <w:tc>
           <w:tcPr>
             <w:tcW w:type="dxa" w:w="3402"/>
@@ -526,6 +553,9 @@
         </w:tc>
       </w:tr>
       <w:tr>
+        <w:trPr>
+          <w:cantSplit/>
+        </w:trPr>
         <w:tc>
           <w:tcPr>
             <w:tcW w:type="dxa" w:w="3402"/>
@@ -554,6 +584,9 @@
         </w:tc>
       </w:tr>
       <w:tr>
+        <w:trPr>
+          <w:cantSplit/>
+        </w:trPr>
         <w:tc>
           <w:tcPr>
             <w:tcW w:type="dxa" w:w="3402"/>
@@ -582,6 +615,9 @@
         </w:tc>
       </w:tr>
       <w:tr>
+        <w:trPr>
+          <w:cantSplit/>
+        </w:trPr>
         <w:tc>
           <w:tcPr>
             <w:tcW w:type="dxa" w:w="3402"/>
@@ -610,6 +646,9 @@
         </w:tc>
       </w:tr>
       <w:tr>
+        <w:trPr>
+          <w:cantSplit/>
+        </w:trPr>
         <w:tc>
           <w:tcPr>
             <w:tcW w:type="dxa" w:w="3402"/>
@@ -638,6 +677,9 @@
         </w:tc>
       </w:tr>
       <w:tr>
+        <w:trPr>
+          <w:cantSplit/>
+        </w:trPr>
         <w:tc>
           <w:tcPr>
             <w:tcW w:type="dxa" w:w="3402"/>
@@ -674,6 +716,580 @@
     </w:p>
     <w:p>
       <w:pPr>
+        <w:keepNext/>
+        <w:spacing w:after="60" w:before="160"/>
+      </w:pPr>
+      <w:r>
+        <w:rPr>
+          <w:b/>
+          <w:i w:val="0"/>
+          <w:sz w:val="26"/>
+        </w:rPr>
+        <w:t>Begriffe in einfachen Worten</w:t>
+      </w:r>
+    </w:p>
+    <w:p>
+      <w:pPr>
+        <w:keepNext w:val="0"/>
+        <w:spacing w:after="80" w:before="0"/>
+      </w:pPr>
+      <w:r>
+        <w:rPr>
+          <w:b w:val="0"/>
+          <w:i w:val="0"/>
+          <w:color w:val="5B6472"/>
+          <w:sz w:val="20"/>
+        </w:rPr>
+        <w:t>Diese Begriffe sollte jede und jeder von euch in einem Satz erklären können, auch wenn sie in eurem Teil nicht vorkommen.</w:t>
+      </w:r>
+    </w:p>
+    <w:tbl>
+      <w:tblPr>
+        <w:tblStyle w:val="LightGrid-Accent1"/>
+        <w:tblW w:type="auto" w:w="0"/>
+        <w:tblLayout w:type="fixed"/>
+        <w:tblLook w:firstColumn="1" w:firstRow="1" w:lastColumn="0" w:lastRow="0" w:noHBand="0" w:noVBand="1" w:val="04A0"/>
+      </w:tblPr>
+      <w:tblGrid>
+        <w:gridCol w:w="2551"/>
+        <w:gridCol w:w="6803"/>
+      </w:tblGrid>
+      <w:tr>
+        <w:trPr>
+          <w:cantSplit/>
+        </w:trPr>
+        <w:tc>
+          <w:tcPr>
+            <w:tcW w:type="dxa" w:w="2551"/>
+          </w:tcPr>
+          <w:p>
+            <w:r>
+              <w:rPr>
+                <w:sz w:val="19"/>
+              </w:rPr>
+              <w:t>Begriff</w:t>
+            </w:r>
+          </w:p>
+        </w:tc>
+        <w:tc>
+          <w:tcPr>
+            <w:tcW w:type="dxa" w:w="6803"/>
+          </w:tcPr>
+          <w:p>
+            <w:r>
+              <w:rPr>
+                <w:sz w:val="19"/>
+              </w:rPr>
+              <w:t>Einfach erklärt</w:t>
+            </w:r>
+          </w:p>
+        </w:tc>
+      </w:tr>
+      <w:tr>
+        <w:trPr>
+          <w:cantSplit/>
+        </w:trPr>
+        <w:tc>
+          <w:tcPr>
+            <w:tcW w:type="dxa" w:w="2551"/>
+          </w:tcPr>
+          <w:p>
+            <w:r>
+              <w:rPr>
+                <w:sz w:val="19"/>
+              </w:rPr>
+              <w:t>Funktion</w:t>
+            </w:r>
+          </w:p>
+        </w:tc>
+        <w:tc>
+          <w:tcPr>
+            <w:tcW w:type="dxa" w:w="6803"/>
+          </w:tcPr>
+          <w:p>
+            <w:r>
+              <w:rPr>
+                <w:sz w:val="19"/>
+              </w:rPr>
+              <w:t>Ein Rezept mit Namen: Zutaten (Argumente) rein, immer dieselben Schritte, Ergebnis (return) raus.</w:t>
+            </w:r>
+          </w:p>
+        </w:tc>
+      </w:tr>
+      <w:tr>
+        <w:trPr>
+          <w:cantSplit/>
+        </w:trPr>
+        <w:tc>
+          <w:tcPr>
+            <w:tcW w:type="dxa" w:w="2551"/>
+          </w:tcPr>
+          <w:p>
+            <w:r>
+              <w:rPr>
+                <w:sz w:val="19"/>
+              </w:rPr>
+              <w:t>Argument mit Standardwert</w:t>
+            </w:r>
+          </w:p>
+        </w:tc>
+        <w:tc>
+          <w:tcPr>
+            <w:tcW w:type="dxa" w:w="6803"/>
+          </w:tcPr>
+          <w:p>
+            <w:r>
+              <w:rPr>
+                <w:sz w:val="19"/>
+              </w:rPr>
+              <w:t>Eine Voreinstellung: Gibt man nichts an, nimmt Python den vorgegebenen Wert.</w:t>
+            </w:r>
+          </w:p>
+        </w:tc>
+      </w:tr>
+      <w:tr>
+        <w:trPr>
+          <w:cantSplit/>
+        </w:trPr>
+        <w:tc>
+          <w:tcPr>
+            <w:tcW w:type="dxa" w:w="2551"/>
+          </w:tcPr>
+          <w:p>
+            <w:r>
+              <w:rPr>
+                <w:sz w:val="19"/>
+              </w:rPr>
+              <w:t>Tupel / Dictionary</w:t>
+            </w:r>
+          </w:p>
+        </w:tc>
+        <w:tc>
+          <w:tcPr>
+            <w:tcW w:type="dxa" w:w="6803"/>
+          </w:tcPr>
+          <w:p>
+            <w:r>
+              <w:rPr>
+                <w:sz w:val="19"/>
+              </w:rPr>
+              <w:t>Mehrere Ergebnisse in einem Paket. Beim Dictionary hat jedes Ergebnis einen Namen.</w:t>
+            </w:r>
+          </w:p>
+        </w:tc>
+      </w:tr>
+      <w:tr>
+        <w:trPr>
+          <w:cantSplit/>
+        </w:trPr>
+        <w:tc>
+          <w:tcPr>
+            <w:tcW w:type="dxa" w:w="2551"/>
+          </w:tcPr>
+          <w:p>
+            <w:r>
+              <w:rPr>
+                <w:sz w:val="19"/>
+              </w:rPr>
+              <w:t>Lambda</w:t>
+            </w:r>
+          </w:p>
+        </w:tc>
+        <w:tc>
+          <w:tcPr>
+            <w:tcW w:type="dxa" w:w="6803"/>
+          </w:tcPr>
+          <w:p>
+            <w:r>
+              <w:rPr>
+                <w:sz w:val="19"/>
+              </w:rPr>
+              <w:t>Eine Mini-Funktion ohne Namen, nur eine Zeile lang.</w:t>
+            </w:r>
+          </w:p>
+        </w:tc>
+      </w:tr>
+      <w:tr>
+        <w:trPr>
+          <w:cantSplit/>
+        </w:trPr>
+        <w:tc>
+          <w:tcPr>
+            <w:tcW w:type="dxa" w:w="2551"/>
+          </w:tcPr>
+          <w:p>
+            <w:r>
+              <w:rPr>
+                <w:sz w:val="19"/>
+              </w:rPr>
+              <w:t>partial (Currying)</w:t>
+            </w:r>
+          </w:p>
+        </w:tc>
+        <w:tc>
+          <w:tcPr>
+            <w:tcW w:type="dxa" w:w="6803"/>
+          </w:tcPr>
+          <w:p>
+            <w:r>
+              <w:rPr>
+                <w:sz w:val="19"/>
+              </w:rPr>
+              <w:t>Ein Argument fest einbauen, so entsteht eine speziellere Funktion (z. B. quote_frauen).</w:t>
+            </w:r>
+          </w:p>
+        </w:tc>
+      </w:tr>
+      <w:tr>
+        <w:trPr>
+          <w:cantSplit/>
+        </w:trPr>
+        <w:tc>
+          <w:tcPr>
+            <w:tcW w:type="dxa" w:w="2551"/>
+          </w:tcPr>
+          <w:p>
+            <w:r>
+              <w:rPr>
+                <w:sz w:val="19"/>
+              </w:rPr>
+              <w:t>Generator (yield)</w:t>
+            </w:r>
+          </w:p>
+        </w:tc>
+        <w:tc>
+          <w:tcPr>
+            <w:tcW w:type="dxa" w:w="6803"/>
+          </w:tcPr>
+          <w:p>
+            <w:r>
+              <w:rPr>
+                <w:sz w:val="19"/>
+              </w:rPr>
+              <w:t>Liefert Ergebnisse eines nach dem anderen, wie ein Kellner Gang für Gang.</w:t>
+            </w:r>
+          </w:p>
+        </w:tc>
+      </w:tr>
+      <w:tr>
+        <w:trPr>
+          <w:cantSplit/>
+        </w:trPr>
+        <w:tc>
+          <w:tcPr>
+            <w:tcW w:type="dxa" w:w="2551"/>
+          </w:tcPr>
+          <w:p>
+            <w:r>
+              <w:rPr>
+                <w:sz w:val="19"/>
+              </w:rPr>
+              <w:t>Library</w:t>
+            </w:r>
+          </w:p>
+        </w:tc>
+        <w:tc>
+          <w:tcPr>
+            <w:tcW w:type="dxa" w:w="6803"/>
+          </w:tcPr>
+          <w:p>
+            <w:r>
+              <w:rPr>
+                <w:sz w:val="19"/>
+              </w:rPr>
+              <w:t>Ein fertiger Werkzeugkasten, z. B. pandas für Tabellen und matplotlib für Diagramme.</w:t>
+            </w:r>
+          </w:p>
+        </w:tc>
+      </w:tr>
+      <w:tr>
+        <w:trPr>
+          <w:cantSplit/>
+        </w:trPr>
+        <w:tc>
+          <w:tcPr>
+            <w:tcW w:type="dxa" w:w="2551"/>
+          </w:tcPr>
+          <w:p>
+            <w:r>
+              <w:rPr>
+                <w:sz w:val="19"/>
+              </w:rPr>
+              <w:t>Zulassungsquote</w:t>
+            </w:r>
+          </w:p>
+        </w:tc>
+        <w:tc>
+          <w:tcPr>
+            <w:tcW w:type="dxa" w:w="6803"/>
+          </w:tcPr>
+          <w:p>
+            <w:r>
+              <w:rPr>
+                <w:sz w:val="19"/>
+              </w:rPr>
+              <w:t>Anteil der Bewerbungen, die angenommen wurden, z. B. 557 von 1 835 Frauen = 30.4 %.</w:t>
+            </w:r>
+          </w:p>
+        </w:tc>
+      </w:tr>
+      <w:tr>
+        <w:trPr>
+          <w:cantSplit/>
+        </w:trPr>
+        <w:tc>
+          <w:tcPr>
+            <w:tcW w:type="dxa" w:w="2551"/>
+          </w:tcPr>
+          <w:p>
+            <w:r>
+              <w:rPr>
+                <w:sz w:val="19"/>
+              </w:rPr>
+              <w:t>Prozentpunkte</w:t>
+            </w:r>
+          </w:p>
+        </w:tc>
+        <w:tc>
+          <w:tcPr>
+            <w:tcW w:type="dxa" w:w="6803"/>
+          </w:tcPr>
+          <w:p>
+            <w:r>
+              <w:rPr>
+                <w:sz w:val="19"/>
+              </w:rPr>
+              <w:t>Differenz zweier Prozentwerte: 44.52 % − 30.35 % ≈ 14.2 Prozentpunkte. Nicht «14.2 Prozent» sagen!</w:t>
+            </w:r>
+          </w:p>
+        </w:tc>
+      </w:tr>
+      <w:tr>
+        <w:trPr>
+          <w:cantSplit/>
+        </w:trPr>
+        <w:tc>
+          <w:tcPr>
+            <w:tcW w:type="dxa" w:w="2551"/>
+          </w:tcPr>
+          <w:p>
+            <w:r>
+              <w:rPr>
+                <w:sz w:val="19"/>
+              </w:rPr>
+              <w:t>Bedingte Wahrscheinlichkeit P(Z|W)</w:t>
+            </w:r>
+          </w:p>
+        </w:tc>
+        <w:tc>
+          <w:tcPr>
+            <w:tcW w:type="dxa" w:w="6803"/>
+          </w:tcPr>
+          <w:p>
+            <w:r>
+              <w:rPr>
+                <w:sz w:val="19"/>
+              </w:rPr>
+              <w:t>Wahrscheinlichkeit für «zugelassen», wenn man nur die Bewerbungen von Frauen betrachtet.</w:t>
+            </w:r>
+          </w:p>
+        </w:tc>
+      </w:tr>
+      <w:tr>
+        <w:trPr>
+          <w:cantSplit/>
+        </w:trPr>
+        <w:tc>
+          <w:tcPr>
+            <w:tcW w:type="dxa" w:w="2551"/>
+          </w:tcPr>
+          <w:p>
+            <w:r>
+              <w:rPr>
+                <w:sz w:val="19"/>
+              </w:rPr>
+              <w:t>P(Z ∩ W)</w:t>
+            </w:r>
+          </w:p>
+        </w:tc>
+        <w:tc>
+          <w:tcPr>
+            <w:tcW w:type="dxa" w:w="6803"/>
+          </w:tcPr>
+          <w:p>
+            <w:r>
+              <w:rPr>
+                <w:sz w:val="19"/>
+              </w:rPr>
+              <w:t>Anteil aller Bewerbungen, die von einer Frau stammen UND zugelassen wurden.</w:t>
+            </w:r>
+          </w:p>
+        </w:tc>
+      </w:tr>
+      <w:tr>
+        <w:trPr>
+          <w:cantSplit/>
+        </w:trPr>
+        <w:tc>
+          <w:tcPr>
+            <w:tcW w:type="dxa" w:w="2551"/>
+          </w:tcPr>
+          <w:p>
+            <w:r>
+              <w:rPr>
+                <w:sz w:val="19"/>
+              </w:rPr>
+              <w:t>Stochastisch unabhängig</w:t>
+            </w:r>
+          </w:p>
+        </w:tc>
+        <w:tc>
+          <w:tcPr>
+            <w:tcW w:type="dxa" w:w="6803"/>
+          </w:tcPr>
+          <w:p>
+            <w:r>
+              <w:rPr>
+                <w:sz w:val="19"/>
+              </w:rPr>
+              <w:t>Das eine Merkmal ändert nichts am anderen: Das Geschlecht spielt für die Zulassung keine Rolle. Prüfung: P(Z ∩ W) = P(Z) · P(W).</w:t>
+            </w:r>
+          </w:p>
+        </w:tc>
+      </w:tr>
+      <w:tr>
+        <w:trPr>
+          <w:cantSplit/>
+        </w:trPr>
+        <w:tc>
+          <w:tcPr>
+            <w:tcW w:type="dxa" w:w="2551"/>
+          </w:tcPr>
+          <w:p>
+            <w:r>
+              <w:rPr>
+                <w:sz w:val="19"/>
+              </w:rPr>
+              <w:t>Gewichteter Mittelwert</w:t>
+            </w:r>
+          </w:p>
+        </w:tc>
+        <w:tc>
+          <w:tcPr>
+            <w:tcW w:type="dxa" w:w="6803"/>
+          </w:tcPr>
+          <w:p>
+            <w:r>
+              <w:rPr>
+                <w:sz w:val="19"/>
+              </w:rPr>
+              <w:t>Wie der Notenschnitt mit ECTS: Was mehr Gewicht hat, zählt mehr.</w:t>
+            </w:r>
+          </w:p>
+        </w:tc>
+      </w:tr>
+      <w:tr>
+        <w:trPr>
+          <w:cantSplit/>
+        </w:trPr>
+        <w:tc>
+          <w:tcPr>
+            <w:tcW w:type="dxa" w:w="2551"/>
+          </w:tcPr>
+          <w:p>
+            <w:r>
+              <w:rPr>
+                <w:sz w:val="19"/>
+              </w:rPr>
+              <w:t>Totale Wahrscheinlichkeit</w:t>
+            </w:r>
+          </w:p>
+        </w:tc>
+        <w:tc>
+          <w:tcPr>
+            <w:tcW w:type="dxa" w:w="6803"/>
+          </w:tcPr>
+          <w:p>
+            <w:r>
+              <w:rPr>
+                <w:sz w:val="19"/>
+              </w:rPr>
+              <w:t>Gesamtquote = Summe über alle Fachbereiche von Anteil × Quote dort («alle Wege im Baumdiagramm»).</w:t>
+            </w:r>
+          </w:p>
+        </w:tc>
+      </w:tr>
+      <w:tr>
+        <w:trPr>
+          <w:cantSplit/>
+        </w:trPr>
+        <w:tc>
+          <w:tcPr>
+            <w:tcW w:type="dxa" w:w="2551"/>
+          </w:tcPr>
+          <w:p>
+            <w:r>
+              <w:rPr>
+                <w:sz w:val="19"/>
+              </w:rPr>
+              <w:t>Korrelation</w:t>
+            </w:r>
+          </w:p>
+        </w:tc>
+        <w:tc>
+          <w:tcPr>
+            <w:tcW w:type="dxa" w:w="6803"/>
+          </w:tcPr>
+          <w:p>
+            <w:r>
+              <w:rPr>
+                <w:sz w:val="19"/>
+              </w:rPr>
+              <w:t>Mass von −1 bis +1 für einen Zusammenhang. −0.79: je mehr Frauen, desto tiefer die Quote, und zwar deutlich.</w:t>
+            </w:r>
+          </w:p>
+        </w:tc>
+      </w:tr>
+      <w:tr>
+        <w:trPr>
+          <w:cantSplit/>
+        </w:trPr>
+        <w:tc>
+          <w:tcPr>
+            <w:tcW w:type="dxa" w:w="2551"/>
+          </w:tcPr>
+          <w:p>
+            <w:r>
+              <w:rPr>
+                <w:sz w:val="19"/>
+              </w:rPr>
+              <w:t>Simpson-Paradoxon</w:t>
+            </w:r>
+          </w:p>
+        </w:tc>
+        <w:tc>
+          <w:tcPr>
+            <w:tcW w:type="dxa" w:w="6803"/>
+          </w:tcPr>
+          <w:p>
+            <w:r>
+              <w:rPr>
+                <w:sz w:val="19"/>
+              </w:rPr>
+              <w:t>Jede Gruppe einzeln zeigt etwas anderes als alle Gruppen zusammen, weil eine Drittvariable (hier der Fachbereich) mitspielt.</w:t>
+            </w:r>
+          </w:p>
+        </w:tc>
+      </w:tr>
+    </w:tbl>
+    <w:p>
+      <w:pPr>
+        <w:keepNext w:val="0"/>
+        <w:spacing w:after="80" w:before="0"/>
+      </w:pPr>
+    </w:p>
+    <w:p>
+      <w:pPr>
         <w:keepNext w:val="0"/>
         <w:spacing w:after="120" w:before="280"/>
       </w:pPr>
@@ -749,6 +1365,7 @@
     </w:p>
     <w:p>
       <w:pPr>
+        <w:keepNext w:val="0"/>
         <w:spacing w:after="100"/>
       </w:pPr>
       <w:r>
@@ -860,6 +1477,7 @@
     </w:p>
     <w:p>
       <w:pPr>
+        <w:keepNext w:val="0"/>
         <w:spacing w:after="100"/>
       </w:pPr>
       <w:r>
@@ -955,6 +1573,7 @@
     </w:p>
     <w:p>
       <w:pPr>
+        <w:keepNext w:val="0"/>
         <w:spacing w:after="100"/>
       </w:pPr>
       <w:r>
@@ -1060,7 +1679,7 @@
           <w:i w:val="0"/>
           <w:sz w:val="22"/>
         </w:rPr>
-        <w:t>Laut McKinney sind Funktionen die wichtigste Methode, um Code in Python zu organisieren und wiederzuverwenden. Sie machen Code ausserdem lesbarer, weil sie einer Gruppe von Anweisungen einen Namen geben.</w:t>
+        <w:t>Eine Funktion kann man sich wie ein Rezept vorstellen: Man gibt Zutaten hinein, sie arbeitet immer dieselben Schritte ab und gibt ein Ergebnis zurück. Laut McKinney sind Funktionen deshalb die wichtigste Methode, um Code zu ordnen und wiederzuverwenden.</w:t>
       </w:r>
     </w:p>
     <w:p>
@@ -1075,7 +1694,7 @@
           <w:i w:val="0"/>
           <w:sz w:val="22"/>
         </w:rPr>
-        <w:t>Links sehen Sie die vier Grundlagen. Erstens: Eine Funktion wird mit def deklariert und mit return verlassen. Fehlt das return, gibt Python automatisch None zurück.</w:t>
+        <w:t>Links sehen Sie die vier Grundlagen. Erstens: Mit def gibt man dem Rezept einen Namen, mit return gibt es das Ergebnis heraus.</w:t>
       </w:r>
     </w:p>
     <w:p>
@@ -1090,7 +1709,7 @@
           <w:i w:val="0"/>
           <w:sz w:val="22"/>
         </w:rPr>
-        <w:t>Zweitens gibt es Positions- und Keyword-Argumente. Positionsargumente werden über ihre Reihenfolge zugeordnet, Keyword-Argumente über ihren Namen. Keyword-Argumente haben oft einen Standardwert und müssen immer nach den Positionsargumenten stehen.</w:t>
+        <w:t>Zweitens die Argumente, also die Zutaten. Man kann sie der Reihe nach übergeben oder mit ihrem Namen. Ein Argument mit Namen kann eine Voreinstellung haben: Gibt man nichts an, nimmt Python diesen Standardwert.</w:t>
       </w:r>
     </w:p>
     <w:p>
@@ -1105,7 +1724,7 @@
           <w:i w:val="0"/>
           <w:sz w:val="22"/>
         </w:rPr>
-        <w:t>Rechts sehen Sie das in unserem Code. Die Funktion kreuztabelle hat das Keyword-Argument fachbereich mit dem Standardwert None. Ruft man sie ohne diese Angabe auf, erstellt sie die Kreuztabelle über alle Bewerbungen. Mit fachbereich gleich A filtert sie zuerst die Zeilen von Fachbereich A. pivot_table aus pandas fasst die Anzahlen dann zu einer Tabelle Geschlecht mal Entscheid zusammen. Eine einzige Funktion reicht so für die Gesamtbetrachtung und für alle sechs Fachbereiche.</w:t>
+        <w:t>Rechts sehen Sie das in unserem Code. Die Funktion kreuztabelle zählt, wie viele Frauen und Männer zugelassen und abgelehnt wurden. Das Argument fachbereich ist standardmässig leer. Ruft man sie ohne Angabe auf, zählt sie über alle Bewerbungen. Schreibt man fachbereich gleich A, zählt sie nur in Fachbereich A. Eine einzige Funktion reicht so für das Gesamtbild und alle sechs Fachbereiche.</w:t>
       </w:r>
     </w:p>
     <w:p>
@@ -1120,7 +1739,7 @@
           <w:i w:val="0"/>
           <w:sz w:val="22"/>
         </w:rPr>
-        <w:t>Drittens der Namensraum: Variablen in einer Funktion leben nur während des Aufrufs. McKinney rät von global ab, deshalb bekommen alle unsere Funktionen ihre Daten als Argument.</w:t>
+        <w:t>Drittens: Was in einer Funktion passiert, bleibt in der Funktion. Ihre Variablen verschwinden nach dem Aufruf wieder. Deshalb geben wir jeder Funktion die Daten ausdrücklich mit, statt irgendwo global darauf zuzugreifen.</w:t>
       </w:r>
     </w:p>
     <w:p>
@@ -1135,11 +1754,12 @@
           <w:i w:val="0"/>
           <w:sz w:val="22"/>
         </w:rPr>
-        <w:t>Viertens: Gibt eine Funktion scheinbar mehrere Werte zurück, ist das eigentlich ein Tupel. Unsere Funktion kennzahlen liefert Quote und Anteil, und wir entpacken beide direkt in zwei Variablen.</w:t>
+        <w:t>Viertens: Eine Funktion kann mehrere Ergebnisse in einem Paket zurückgeben, einem sogenannten Tupel. Unsere Funktion kennzahlen liefert so Quote und Anteil auf einmal.</w:t>
       </w:r>
     </w:p>
     <w:p>
       <w:pPr>
+        <w:keepNext/>
         <w:spacing w:after="100"/>
       </w:pPr>
       <w:r>
@@ -1237,7 +1857,7 @@
           <w:i w:val="0"/>
           <w:sz w:val="22"/>
         </w:rPr>
-        <w:t>Erstens sind Funktionen in Python Objekte. Man kann sie deshalb in eine Liste packen. Genau so bereinigen wir die Werte aus Tabelle 4: Leerzeichen entfernen, Prozentzeichen entfernen, in eine Zahl umwandeln. Das ist dasselbe Muster wie McKinneys clean_strings.</w:t>
+        <w:t>Erstens kann man Funktionen wie normale Werte behandeln, zum Beispiel in eine Liste packen. Das ist wie eine Checkliste mit Arbeitsschritten: Leerzeichen entfernen, Prozentzeichen entfernen, in eine Zahl umwandeln. Jeder Wert aus Tabelle 4 läuft einmal durch diese Liste.</w:t>
       </w:r>
     </w:p>
     <w:p>
@@ -1252,7 +1872,7 @@
           <w:i w:val="0"/>
           <w:sz w:val="22"/>
         </w:rPr>
-        <w:t>Zweitens Lambda-Funktionen: anonyme Einzeiler. Wir übergeben sie zum Beispiel, um Achsen in Prozent zu beschriften.</w:t>
+        <w:t>Zweitens Lambda-Funktionen: kleine Funktionen ohne Namen, die nur eine Zeile lang sind. Wir brauchen sie zum Beispiel, damit an den Achsen «40 %» statt «0.4» steht.</w:t>
       </w:r>
     </w:p>
     <w:p>
@@ -1267,7 +1887,7 @@
           <w:i w:val="0"/>
           <w:sz w:val="22"/>
         </w:rPr>
-        <w:t>Drittens Currying mit partial: Aus der allgemeinen Funktion bedingte_quote machen wir quote_frauen, indem wir das Geschlecht fest einsetzen. Das Ergebnis ist P von Z gegeben W.</w:t>
+        <w:t>Drittens partial, bei McKinney Currying genannt: Man legt ein Argument fest und erhält eine neue, speziellere Funktion. Aus der allgemeinen Funktion bedingte_quote wird so quote_frauen, die immer nur die Zulassungsquote der Frauen berechnet.</w:t>
       </w:r>
     </w:p>
     <w:p>
@@ -1282,7 +1902,7 @@
           <w:i w:val="0"/>
           <w:sz w:val="22"/>
         </w:rPr>
-        <w:t>Viertens ein Generator mit yield: Er liefert die Ergebnisse Fachbereich für Fachbereich, und zwar erst dann, wenn sie gebraucht werden.</w:t>
+        <w:t>Viertens ein Generator mit yield: Er arbeitet wie ein Kellner, der Gang für Gang bringt statt alles auf einmal. Bei uns liefert er die Ergebnisse Fachbereich für Fachbereich.</w:t>
       </w:r>
     </w:p>
     <w:p>
@@ -1297,7 +1917,7 @@
           <w:i w:val="0"/>
           <w:sz w:val="22"/>
         </w:rPr>
-        <w:t>Und fünftens die Fehlerbehandlung: Wir fangen nur den ValueError ab. Ein Tippfehler in der Tabelle bricht dann mit einer klaren Meldung ab, statt dass wir unbemerkt mit einer falschen Zahl weiterrechnen.</w:t>
+        <w:t>Und fünftens die Fehlerbehandlung: Steht in der Tabelle aus Versehen etwas, das keine Zahl ist, bekommen wir eine klare Fehlermeldung, statt unbemerkt mit einem falschen Wert weiterzurechnen.</w:t>
       </w:r>
     </w:p>
     <w:p>
@@ -1317,6 +1937,7 @@
     </w:p>
     <w:p>
       <w:pPr>
+        <w:keepNext w:val="0"/>
         <w:spacing w:after="100"/>
       </w:pPr>
       <w:r>
@@ -1468,7 +2089,7 @@
           <w:i w:val="0"/>
           <w:sz w:val="22"/>
         </w:rPr>
-        <w:t>Schritt 3 ist der wichtigste: Für die stochastische Unabhängigkeit brauchen wir Anzahlen, zum Beispiel wie viele Frauen es insgesamt waren. Aus den gerundeten Prozenten lassen sie sich nicht exakt zurückrechnen. Wir übernehmen sie deshalb aus dem Originaldatensatz, der in R als UCBAdmissions verfügbar ist. Der Code prüft, dass diese Anzahlen alle 24 Prozentwerte der Tabelle ergeben. Das Ergebnis sind null Abweichungen.</w:t>
+        <w:t>Schritt 3 ist der wichtigste. Prozente sagen nur «wie viel von», aber nicht «wie viele». Für Teil c brauchen wir aber Anzahlen, zum Beispiel wie viele Frauen sich insgesamt beworben haben. Wir übernehmen sie deshalb aus dem Originaldatensatz, der in R als UCBAdmissions frei verfügbar ist. Zur Sicherheit prüft unser Code, dass diese Anzahlen genau die 24 Prozentwerte aus Tabelle 4 ergeben. Ergebnis: keine einzige Abweichung.</w:t>
       </w:r>
     </w:p>
     <w:p>
@@ -1483,7 +2104,7 @@
           <w:i w:val="0"/>
           <w:sz w:val="22"/>
         </w:rPr>
-        <w:t>Schritt 4: Die Daten liegen als eine lange Tabelle vor, mit einer Zeile pro Fachbereich, Geschlecht und Entscheid. Daraus bildet die Funktion kreuztabelle jede Tabelle, die wir brauchen.</w:t>
+        <w:t>Schritt 4: Wir speichern die Daten als eine lange Liste, eine Zeile pro Fachbereich, Geschlecht und Entscheid. Daraus kann die Funktion kreuztabelle jede Tabelle bauen, die wir brauchen.</w:t>
       </w:r>
     </w:p>
     <w:p>
@@ -1513,11 +2134,12 @@
           <w:i w:val="0"/>
           <w:sz w:val="22"/>
         </w:rPr>
-        <w:t>Unten stehen die Libraries und warum wir sie gewählt haben. pandas ist das Standardwerkzeug für Tabellen, eine Kreuztabelle entsteht damit in einer Zeile. numpy rechnet auf ganzen Spalten ohne Schleifen. matplotlib gibt uns volle Kontrolle über Farben und Beschriftungen. re und functools stammen aus der Standardbibliothek. Alle diese Libraries sind in Anaconda enthalten, das wir im Kurs verwenden.</w:t>
+        <w:t>Unten stehen die Libraries, also fertige Werkzeugkästen, und warum wir sie gewählt haben. pandas ist wie Excel in Python: Tabellen filtern und zusammenfassen geht in einer Zeile. numpy rechnet mit ganzen Spalten auf einmal. matplotlib zeichnet die Diagramme, und wir können Farben und Beschriftungen genau festlegen. re und functools sind bereits in Python eingebaut. Alle diese Libraries sind in Anaconda enthalten, das wir im Kurs verwenden.</w:t>
       </w:r>
     </w:p>
     <w:p>
       <w:pPr>
+        <w:keepNext/>
         <w:spacing w:after="100"/>
       </w:pPr>
       <w:r>
@@ -1665,6 +2287,7 @@
     </w:p>
     <w:p>
       <w:pPr>
+        <w:keepNext w:val="0"/>
         <w:spacing w:after="100"/>
       </w:pPr>
       <w:r>
@@ -1820,6 +2443,7 @@
     </w:p>
     <w:p>
       <w:pPr>
+        <w:keepNext w:val="0"/>
         <w:spacing w:after="100"/>
       </w:pPr>
       <w:r>
@@ -1910,7 +2534,7 @@
           <w:i w:val="0"/>
           <w:sz w:val="22"/>
         </w:rPr>
-        <w:t>Rechts sieht man den Zusammenhang über alle sechs Fachbereiche: Die Korrelation zwischen Frauenanteil und Zulassungsquote beträgt minus 0.79. Zwei Beispiele: In A sind 11.6 Prozent der Bewerbungen von Frauen, die Quote liegt bei 64.4 Prozent. In E sind es 67.3 Prozent Frauen, und die Quote liegt nur bei 25.2 Prozent.</w:t>
+        <w:t>Rechts sieht man das für alle sechs Fachbereiche: Je höher der Frauenanteil, desto tiefer die Zulassungsquote. Die Korrelation beträgt minus 0.79. Minus heisst «je mehr, desto weniger», und 0.79 ist nahe bei 1, also ein starker Zusammenhang. Zwei Beispiele: In A sind 11.6 Prozent der Bewerbungen von Frauen, die Quote liegt bei 64.4 Prozent. In E sind es 67.3 Prozent Frauen, und die Quote liegt nur bei 25.2 Prozent.</w:t>
       </w:r>
     </w:p>
     <w:p>
@@ -1930,6 +2554,7 @@
     </w:p>
     <w:p>
       <w:pPr>
+        <w:keepNext w:val="0"/>
         <w:spacing w:after="100"/>
       </w:pPr>
       <w:r>
@@ -2021,7 +2646,7 @@
           <w:i w:val="0"/>
           <w:sz w:val="22"/>
         </w:rPr>
-        <w:t>Die Formel oben sagt: Die Zulassungsquote eines Geschlechts ist die Summe über alle Fachbereiche, und zwar Anteil der Bewerbungen mal Quote im Fachbereich. Die Gesamtquote ist also ein gewichteter Mittelwert. Die Gewichte sind die Anteile, also wo man sich beworben hat.</w:t>
+        <w:t>Die Formel oben sagt: Man nimmt für jeden Fachbereich den Anteil der Bewerbungen mal die Quote dort und zählt alles zusammen. Das kennen Sie vom Notenschnitt: Ein Modul mit vielen ECTS zählt mehr als eines mit wenigen. Hier zählt ein Fachbereich mehr, je mehr Bewerbungen dort eingingen.</w:t>
       </w:r>
     </w:p>
     <w:p>
@@ -2036,7 +2661,7 @@
           <w:i w:val="0"/>
           <w:sz w:val="22"/>
         </w:rPr>
-        <w:t>Frauen haben ihre grossen Gewichte genau bei den tiefen Quoten. Um diesen Effekt auszuschalten, haben wir für beide Geschlechter dieselben Gewichte eingesetzt, nämlich die Verteilung aller 4 526 Bewerbungen.</w:t>
+        <w:t>Bei den Frauen zählen also genau die Fachbereiche mit tiefen Quoten am meisten. Das drückt ihren Schnitt nach unten. Deshalb haben wir gerechnet, als hätten sich Frauen und Männer genau gleich auf die Fachbereiche verteilt, nämlich so wie alle 4 526 Bewerbungen zusammen.</w:t>
       </w:r>
     </w:p>
     <w:p>
@@ -2051,7 +2676,7 @@
           <w:i w:val="0"/>
           <w:sz w:val="22"/>
         </w:rPr>
-        <w:t>Das Ergebnis sehen Sie rechts: Frauen 43.0 Prozent, Männer 38.7 Prozent. Der Unterschied kehrt sich also um.</w:t>
+        <w:t>Das Ergebnis sehen Sie rechts: Frauen 43.0 Prozent, Männer 38.7 Prozent. Bei gleicher Fachbereichswahl liegen also die Frauen vorne.</w:t>
       </w:r>
     </w:p>
     <w:p>
@@ -2071,6 +2696,7 @@
     </w:p>
     <w:p>
       <w:pPr>
+        <w:keepNext/>
         <w:spacing w:after="100"/>
       </w:pPr>
       <w:r>
@@ -2168,7 +2794,7 @@
           <w:i w:val="0"/>
           <w:sz w:val="22"/>
         </w:rPr>
-        <w:t>Zwei Ereignisse sind stochastisch unabhängig, wenn das eine die Wahrscheinlichkeit des anderen nicht verändert. Formal gilt dann: P von Z geschnitten W gleich P von Z mal P von W. Wir prüfen das genau wie im Beispiel mit Navi und Klimaanlage.</w:t>
+        <w:t>Unabhängig heisst ganz einfach: Das Geschlecht spielt für die Zulassung keine Rolle. Formal gilt dann: P von Z geschnitten W gleich P von Z mal P von W. Wir prüfen das genau wie im Beispiel mit Navi und Klimaanlage.</w:t>
       </w:r>
     </w:p>
     <w:p>
@@ -2183,7 +2809,7 @@
           <w:i w:val="0"/>
           <w:sz w:val="22"/>
         </w:rPr>
-        <w:t>Aus der Kreuztabelle ergibt sich P von Z gleich 0.388 und P von W gleich 0.405. Bei Unabhängigkeit müsste P von Z geschnitten W also 0.157 sein. Beobachtet sind aber nur 0.123, rund 22 Prozent weniger.</w:t>
+        <w:t>In Worten: 38.8 Prozent aller Bewerbungen wurden zugelassen, 40.5 Prozent stammen von Frauen. Spielt das Geschlecht keine Rolle, müssten 38.8 Prozent von diesen 40.5 Prozent zugelassene Frauen sein, das sind 15.7 Prozent aller Bewerbungen. Tatsächlich sind es aber nur 12.3 Prozent, rund 22 Prozent weniger als erwartet.</w:t>
       </w:r>
     </w:p>
     <w:p>
@@ -2213,11 +2839,12 @@
           <w:i w:val="0"/>
           <w:sz w:val="22"/>
         </w:rPr>
-        <w:t>Im Code berechnet das die Funktion pruefe_unabhaengigkeit. Sie gibt alle Kennzahlen als Dictionary zurück, damit man sie über ihren Namen ansprechen kann.</w:t>
+        <w:t>Im Code berechnet das die Funktion pruefe_unabhaengigkeit. Sie gibt alle Kennzahlen als Dictionary zurück, das ist wie ein Nachschlagewerk: Jede Zahl hat einen Namen, unter dem man sie findet.</w:t>
       </w:r>
     </w:p>
     <w:p>
       <w:pPr>
+        <w:keepNext/>
         <w:spacing w:after="100"/>
       </w:pPr>
       <w:r>
@@ -2330,7 +2957,7 @@
           <w:i w:val="0"/>
           <w:sz w:val="22"/>
         </w:rPr>
-        <w:t>Rechts liegen P von Z geschnitten W und das Produkt jeweils nahe beieinander. Innerhalb der Fachbereiche sind Zulassung und Geschlecht also annähernd unabhängig.</w:t>
+        <w:t>Rechts liegen der beobachtete und der erwartete Wert jeweils nahe beieinander. Innerhalb der Fachbereiche spielt das Geschlecht also kaum eine Rolle, Zulassung und Geschlecht sind annähernd unabhängig.</w:t>
       </w:r>
     </w:p>
     <w:p>
@@ -2365,6 +2992,7 @@
     </w:p>
     <w:p>
       <w:pPr>
+        <w:keepNext w:val="0"/>
         <w:spacing w:after="100"/>
       </w:pPr>
       <w:r>
@@ -2440,11 +3068,12 @@
           <w:i w:val="0"/>
           <w:sz w:val="22"/>
         </w:rPr>
-        <w:t>Frauen bewarben sich häufiger in stark umkämpften Fachbereichen. Fasst man die Fachbereiche zusammen, kehrt sich der Zusammenhang um. Dieses Phänomen heisst nach Edward Simpson das Simpson-Paradoxon. Die Berkeley-Daten werden häufig verwendet, um es zu veranschaulichen.</w:t>
+        <w:t>Frauen bewarben sich häufiger in stark umkämpften Fachbereichen. Schaut man jeden Fachbereich einzeln an, haben Frauen keinen Nachteil. Wirft man alle zusammen, sieht es plötzlich nach einem Nachteil aus. Dieses Phänomen heisst nach Edward Simpson das Simpson-Paradoxon. Die Berkeley-Daten werden häufig verwendet, um es zu veranschaulichen.</w:t>
       </w:r>
     </w:p>
     <w:p>
       <w:pPr>
+        <w:keepNext w:val="0"/>
         <w:spacing w:after="100"/>
       </w:pPr>
       <w:r>
@@ -2570,6 +3199,7 @@
     </w:p>
     <w:p>
       <w:pPr>
+        <w:keepNext w:val="0"/>
         <w:spacing w:after="100"/>
       </w:pPr>
       <w:r>

</xml_diff>